<commit_message>
Six manuscript figures rendered from the simulator and measured results; embedded in the CN draft and docx
</commit_message>
<xml_diff>
--- a/research/血管微机器人集群取栓_方法与NMI投稿初稿_20261006.docx
+++ b/research/血管微机器人集群取栓_方法与NMI投稿初稿_20261006.docx
@@ -967,6 +967,58 @@
           <w:rFonts w:ascii="微软雅黑" w:hAnsi="微软雅黑" w:eastAsia="微软雅黑"/>
         </w:rPr>
         <w:t>这是主指标。另报原始成功率（只要求清除）、T50/T90/T100、清除率曲线下面积（AUC）、单位血栓路径长度、壁接触秒数、粒子碰撞事件、间距违规对秒、死锁代理事件、超时率。</w:t>
+      </w:r>
+    </w:p>
+    <w:p>
+      <w:pPr>
+        <w:jc w:val="center"/>
+      </w:pPr>
+      <w:r>
+        <w:drawing>
+          <wp:inline xmlns:a="http://schemas.openxmlformats.org/drawingml/2006/main" xmlns:pic="http://schemas.openxmlformats.org/drawingml/2006/picture">
+            <wp:extent cx="5760720" cy="3062854"/>
+            <wp:docPr id="1" name="Picture 1"/>
+            <wp:cNvGraphicFramePr>
+              <a:graphicFrameLocks noChangeAspect="1"/>
+            </wp:cNvGraphicFramePr>
+            <a:graphic>
+              <a:graphicData uri="http://schemas.openxmlformats.org/drawingml/2006/picture">
+                <pic:pic>
+                  <pic:nvPicPr>
+                    <pic:cNvPr id="0" name="fig1_scene.png"/>
+                    <pic:cNvPicPr/>
+                  </pic:nvPicPr>
+                  <pic:blipFill>
+                    <a:blip r:embed="rId9"/>
+                    <a:stretch>
+                      <a:fillRect/>
+                    </a:stretch>
+                  </pic:blipFill>
+                  <pic:spPr>
+                    <a:xfrm>
+                      <a:off x="0" y="0"/>
+                      <a:ext cx="5760720" cy="3062854"/>
+                    </a:xfrm>
+                    <a:prstGeom prst="rect"/>
+                  </pic:spPr>
+                </pic:pic>
+              </a:graphicData>
+            </a:graphic>
+          </wp:inline>
+        </w:drawing>
+      </w:r>
+    </w:p>
+    <w:p>
+      <w:pPr>
+        <w:jc w:val="center"/>
+      </w:pPr>
+      <w:r>
+        <w:rPr>
+          <w:rFonts w:ascii="微软雅黑" w:hAnsi="微软雅黑" w:eastAsia="微软雅黑"/>
+          <w:i/>
+          <w:sz w:val="18"/>
+        </w:rPr>
+        <w:t>图 1  场景与术前分配（mca_m1_lvo, N=3）。左：俯视 x–y，右：侧视 x–z。虚线为分配 A 给出的行程；血管粗细与健康管腔半径成正比。</w:t>
       </w:r>
     </w:p>
     <w:p>
@@ -2045,6 +2097,58 @@
     </w:p>
     <w:p>
       <w:pPr>
+        <w:jc w:val="center"/>
+      </w:pPr>
+      <w:r>
+        <w:drawing>
+          <wp:inline xmlns:a="http://schemas.openxmlformats.org/drawingml/2006/main" xmlns:pic="http://schemas.openxmlformats.org/drawingml/2006/picture">
+            <wp:extent cx="5760720" cy="2742885"/>
+            <wp:docPr id="2" name="Picture 2"/>
+            <wp:cNvGraphicFramePr>
+              <a:graphicFrameLocks noChangeAspect="1"/>
+            </wp:cNvGraphicFramePr>
+            <a:graphic>
+              <a:graphicData uri="http://schemas.openxmlformats.org/drawingml/2006/picture">
+                <pic:pic>
+                  <pic:nvPicPr>
+                    <pic:cNvPr id="0" name="fig2_perception.png"/>
+                    <pic:cNvPicPr/>
+                  </pic:nvPicPr>
+                  <pic:blipFill>
+                    <a:blip r:embed="rId10"/>
+                    <a:stretch>
+                      <a:fillRect/>
+                    </a:stretch>
+                  </pic:blipFill>
+                  <pic:spPr>
+                    <a:xfrm>
+                      <a:off x="0" y="0"/>
+                      <a:ext cx="5760720" cy="2742885"/>
+                    </a:xfrm>
+                    <a:prstGeom prst="rect"/>
+                  </pic:spPr>
+                </pic:pic>
+              </a:graphicData>
+            </a:graphic>
+          </wp:inline>
+        </w:drawing>
+      </w:r>
+    </w:p>
+    <w:p>
+      <w:pPr>
+        <w:jc w:val="center"/>
+      </w:pPr>
+      <w:r>
+        <w:rPr>
+          <w:rFonts w:ascii="微软雅黑" w:hAnsi="微软雅黑" w:eastAsia="微软雅黑"/>
+          <w:i/>
+          <w:sz w:val="18"/>
+        </w:rPr>
+        <w:t>图 2  图像感知链：控制器实际看到的双视角相机图像与检测器输出（圆圈为检测结果，蓝色判为集群、黄色判为粒子），右为整个回合的定位误差分布。</w:t>
+      </w:r>
+    </w:p>
+    <w:p>
+      <w:pPr>
         <w:pStyle w:val="Heading3"/>
       </w:pPr>
       <w:r>
@@ -2756,6 +2860,58 @@
     </w:p>
     <w:p>
       <w:pPr>
+        <w:jc w:val="center"/>
+      </w:pPr>
+      <w:r>
+        <w:drawing>
+          <wp:inline xmlns:a="http://schemas.openxmlformats.org/drawingml/2006/main" xmlns:pic="http://schemas.openxmlformats.org/drawingml/2006/picture">
+            <wp:extent cx="5760720" cy="2297845"/>
+            <wp:docPr id="3" name="Picture 3"/>
+            <wp:cNvGraphicFramePr>
+              <a:graphicFrameLocks noChangeAspect="1"/>
+            </wp:cNvGraphicFramePr>
+            <a:graphic>
+              <a:graphicData uri="http://schemas.openxmlformats.org/drawingml/2006/picture">
+                <pic:pic>
+                  <pic:nvPicPr>
+                    <pic:cNvPr id="0" name="fig3_tpg.png"/>
+                    <pic:cNvPicPr/>
+                  </pic:nvPicPr>
+                  <pic:blipFill>
+                    <a:blip r:embed="rId11"/>
+                    <a:stretch>
+                      <a:fillRect/>
+                    </a:stretch>
+                  </pic:blipFill>
+                  <pic:spPr>
+                    <a:xfrm>
+                      <a:off x="0" y="0"/>
+                      <a:ext cx="5760720" cy="2297845"/>
+                    </a:xfrm>
+                    <a:prstGeom prst="rect"/>
+                  </pic:spPr>
+                </pic:pic>
+              </a:graphicData>
+            </a:graphic>
+          </wp:inline>
+        </w:drawing>
+      </w:r>
+    </w:p>
+    <w:p>
+      <w:pPr>
+        <w:jc w:val="center"/>
+      </w:pPr>
+      <w:r>
+        <w:rPr>
+          <w:rFonts w:ascii="微软雅黑" w:hAnsi="微软雅黑" w:eastAsia="微软雅黑"/>
+          <w:i/>
+          <w:sz w:val="18"/>
+        </w:rPr>
+        <w:t>图 3  TPG 间距协调。左：两个集群行程弧长平面上的三维距离，红线为 d_min + 缓冲，白色虚框为检测到的冲突区。右：实际回合中最近集群间距与 TPG 令其等待的时段（绿色），全程不做侧向偏转。</w:t>
+      </w:r>
+    </w:p>
+    <w:p>
+      <w:pPr>
         <w:pStyle w:val="Heading3"/>
       </w:pPr>
       <w:r>
@@ -6955,6 +7111,58 @@
     </w:tbl>
     <w:p/>
     <w:p>
+      <w:pPr>
+        <w:jc w:val="center"/>
+      </w:pPr>
+      <w:r>
+        <w:drawing>
+          <wp:inline xmlns:a="http://schemas.openxmlformats.org/drawingml/2006/main" xmlns:pic="http://schemas.openxmlformats.org/drawingml/2006/picture">
+            <wp:extent cx="5760720" cy="2338111"/>
+            <wp:docPr id="4" name="Picture 4"/>
+            <wp:cNvGraphicFramePr>
+              <a:graphicFrameLocks noChangeAspect="1"/>
+            </wp:cNvGraphicFramePr>
+            <a:graphic>
+              <a:graphicData uri="http://schemas.openxmlformats.org/drawingml/2006/picture">
+                <pic:pic>
+                  <pic:nvPicPr>
+                    <pic:cNvPr id="0" name="fig4_results.png"/>
+                    <pic:cNvPicPr/>
+                  </pic:nvPicPr>
+                  <pic:blipFill>
+                    <a:blip r:embed="rId12"/>
+                    <a:stretch>
+                      <a:fillRect/>
+                    </a:stretch>
+                  </pic:blipFill>
+                  <pic:spPr>
+                    <a:xfrm>
+                      <a:off x="0" y="0"/>
+                      <a:ext cx="5760720" cy="2338111"/>
+                    </a:xfrm>
+                    <a:prstGeom prst="rect"/>
+                  </pic:spPr>
+                </pic:pic>
+              </a:graphicData>
+            </a:graphic>
+          </wp:inline>
+        </w:drawing>
+      </w:r>
+    </w:p>
+    <w:p>
+      <w:pPr>
+        <w:jc w:val="center"/>
+      </w:pPr>
+      <w:r>
+        <w:rPr>
+          <w:rFonts w:ascii="微软雅黑" w:hAnsi="微软雅黑" w:eastAsia="微软雅黑"/>
+          <w:i/>
+          <w:sz w:val="18"/>
+        </w:rPr>
+        <w:t>图 4  主结果。左：各方法在 N=1/2/3 上的安全成功率（每格 420 回合）。右：配对差值与 95% 自举置信区间，五项全部不含 0。</w:t>
+      </w:r>
+    </w:p>
+    <w:p>
       <w:r>
         <w:rPr>
           <w:rFonts w:ascii="微软雅黑" w:hAnsi="微软雅黑" w:eastAsia="微软雅黑"/>
@@ -7088,6 +7296,58 @@
     </w:p>
     <w:p>
       <w:pPr>
+        <w:jc w:val="center"/>
+      </w:pPr>
+      <w:r>
+        <w:drawing>
+          <wp:inline xmlns:a="http://schemas.openxmlformats.org/drawingml/2006/main" xmlns:pic="http://schemas.openxmlformats.org/drawingml/2006/picture">
+            <wp:extent cx="5760720" cy="3709528"/>
+            <wp:docPr id="5" name="Picture 5"/>
+            <wp:cNvGraphicFramePr>
+              <a:graphicFrameLocks noChangeAspect="1"/>
+            </wp:cNvGraphicFramePr>
+            <a:graphic>
+              <a:graphicData uri="http://schemas.openxmlformats.org/drawingml/2006/picture">
+                <pic:pic>
+                  <pic:nvPicPr>
+                    <pic:cNvPr id="0" name="fig6_trajectories.png"/>
+                    <pic:cNvPicPr/>
+                  </pic:nvPicPr>
+                  <pic:blipFill>
+                    <a:blip r:embed="rId13"/>
+                    <a:stretch>
+                      <a:fillRect/>
+                    </a:stretch>
+                  </pic:blipFill>
+                  <pic:spPr>
+                    <a:xfrm>
+                      <a:off x="0" y="0"/>
+                      <a:ext cx="5760720" cy="3709528"/>
+                    </a:xfrm>
+                    <a:prstGeom prst="rect"/>
+                  </pic:spPr>
+                </pic:pic>
+              </a:graphicData>
+            </a:graphic>
+          </wp:inline>
+        </w:drawing>
+      </w:r>
+    </w:p>
+    <w:p>
+      <w:pPr>
+        <w:jc w:val="center"/>
+      </w:pPr>
+      <w:r>
+        <w:rPr>
+          <w:rFonts w:ascii="微软雅黑" w:hAnsi="微软雅黑" w:eastAsia="微软雅黑"/>
+          <w:i/>
+          <w:sz w:val="18"/>
+        </w:rPr>
+        <w:t>图 6  同一场景、同一分配下的实际轨迹（ica_terminus_t，N=3）。这是一个代表性的不一致场景：420 个配对场景中两者都成功占 53%，仅本文成功占 27%，仅基线成功占 10%，都失败占 10%。</w:t>
+      </w:r>
+    </w:p>
+    <w:p>
+      <w:pPr>
         <w:pStyle w:val="Heading3"/>
       </w:pPr>
       <w:r>
@@ -9485,6 +9745,58 @@
       </w:tr>
     </w:tbl>
     <w:p/>
+    <w:p>
+      <w:pPr>
+        <w:jc w:val="center"/>
+      </w:pPr>
+      <w:r>
+        <w:drawing>
+          <wp:inline xmlns:a="http://schemas.openxmlformats.org/drawingml/2006/main" xmlns:pic="http://schemas.openxmlformats.org/drawingml/2006/picture">
+            <wp:extent cx="5760720" cy="2296775"/>
+            <wp:docPr id="6" name="Picture 6"/>
+            <wp:cNvGraphicFramePr>
+              <a:graphicFrameLocks noChangeAspect="1"/>
+            </wp:cNvGraphicFramePr>
+            <a:graphic>
+              <a:graphicData uri="http://schemas.openxmlformats.org/drawingml/2006/picture">
+                <pic:pic>
+                  <pic:nvPicPr>
+                    <pic:cNvPr id="0" name="fig5_robustness.png"/>
+                    <pic:cNvPicPr/>
+                  </pic:nvPicPr>
+                  <pic:blipFill>
+                    <a:blip r:embed="rId14"/>
+                    <a:stretch>
+                      <a:fillRect/>
+                    </a:stretch>
+                  </pic:blipFill>
+                  <pic:spPr>
+                    <a:xfrm>
+                      <a:off x="0" y="0"/>
+                      <a:ext cx="5760720" cy="2296775"/>
+                    </a:xfrm>
+                    <a:prstGeom prst="rect"/>
+                  </pic:spPr>
+                </pic:pic>
+              </a:graphicData>
+            </a:graphic>
+          </wp:inline>
+        </w:drawing>
+      </w:r>
+    </w:p>
+    <w:p>
+      <w:pPr>
+        <w:jc w:val="center"/>
+      </w:pPr>
+      <w:r>
+        <w:rPr>
+          <w:rFonts w:ascii="微软雅黑" w:hAnsi="微软雅黑" w:eastAsia="微软雅黑"/>
+          <w:i/>
+          <w:sz w:val="18"/>
+        </w:rPr>
+        <w:t>图 5  鲁棒性。左：安全成功率与跟踪发散率随像素尺度的变化，空心标记为逐回合随机相机。右：图像链相对带噪位置模型的配对差值（红色表示 CI 不含 0）。</w:t>
+      </w:r>
+    </w:p>
     <w:p>
       <w:r>
         <w:rPr>

</xml_diff>